<commit_message>
user last login check script
</commit_message>
<xml_diff>
--- a/whitepaper/ROUGH_DRAFT.docx
+++ b/whitepaper/ROUGH_DRAFT.docx
@@ -12,10 +12,7 @@
     </w:p>
     <w:p>
       <w:r>
-        <w:rPr>
-          <w:b/>
-        </w:rPr>
-        <w:t xml:space="preserve">Working draft 0.2 — 23 September 2026</w:t>
+        <w:t xml:space="preserve">Working draft 0.4 — 23 September 2026</w:t>
       </w:r>
     </w:p>
     <w:p>
@@ -93,17 +90,17 @@
     </w:p>
     <w:p>
       <w:r>
-        <w:t xml:space="preserve">For humanitarian IT teams, camera-based river monitoring introduces a field data service with coupled measurement, infrastructure, and support requirements. A camera and edge computer must acquire usable observations, process them against surveyed geometry, retain data through connectivity interruptions, and deliver results whose age and quality are visible to users. The Indonesia deployment shows how failures in storage, scheduling, synchronization, and scientific inputs can interrupt that service even when individual components appear to work. Its humanitarian value depends on partners who can validate the measurements and connect them to an agreed decision process. [1–5]</w:t>
-      </w:r>
-    </w:p>
-    <w:p>
-      <w:r>
-        <w:t xml:space="preserve">The OpenRiverCam project in Indonesia explored what it takes to assemble, deploy, and support this kind of monitoring with the Indonesian Red Cross (PMI), the American Red Cross, academic and government specialists, community volunteers, and technology developers. A solar-powered station was installed at Sukabumi in April 2026. A second, mains-powered station was built for Jakarta but was never deployed because permission for the intended site did not materialize. At Sukabumi, the team established a usable camera calibration after IPB University carried out a total-station survey. Field operation also revealed failures in water-level detection, storage, processing, power scheduling, synchronization, connectivity, and data stewardship. [1–3]</w:t>
-      </w:r>
-    </w:p>
-    <w:p>
-      <w:r>
-        <w:t xml:space="preserve">These findings support a practical conclusion. Camera-based monitoring is promising, and the current deployment has produced useful technical and institutional learning. It has not yet demonstrated that its discharge estimates are accurate across flow conditions or that its data have changed a humanitarian decision. The next phase should start with hydrologic questions and a defined humanitarian use, then test the complete chain from observation to validated data, interpretation, decision, communication, and action. That work calls for a durable partnership with clear responsibility for each step. [2–4]</w:t>
+        <w:t xml:space="preserve">For humanitarian IT teams, camera-based river monitoring introduces a field data service with coupled measurement, infrastructure, and support requirements. A camera and edge computer must acquire usable observations, process them against surveyed geometry, retain data through connectivity interruptions, and deliver results whose age and quality are visible to users. The Indonesia project developed through two installations: an October 2025 installation using a PTBox and an April 2026 installation using devices built by Tom Jordan. Together, they frame the project’s learning about field implementation and the requirements for sustained operation. Its humanitarian value depends on partners who can validate the measurements and connect them to an agreed decision process. [1–5]</w:t>
+      </w:r>
+    </w:p>
+    <w:p>
+      <w:r>
+        <w:t xml:space="preserve">The OpenRiverCam project in Indonesia explored what it takes to assemble, deploy, and support this kind of monitoring with the Indonesian Red Cross (PMI), the American Red Cross, academic and government specialists, community volunteers, and technology developers. The October 2025 PTBox installation was the first phase. In April 2026, the team installed a solar-powered station built by Tom at Sukabumi. Tom also built a mains-powered station for Jakarta, which remained undeployed because permission for the intended site did not materialize. At Sukabumi, the team established a usable camera calibration after IPB University carried out a total-station survey. Field operation helped the team understand site-specific water-level detection, the interaction of storage and processing with power scheduling, and the support arrangements needed for synchronization, connectivity, and data stewardship. [1–3]</w:t>
+      </w:r>
+    </w:p>
+    <w:p>
+      <w:r>
+        <w:t xml:space="preserve">Across these two installation phases, the project moved from the PTBox to devices built by Tom. The April 2026 phase established the working station and camera calibration described below, providing a basis for further technical and institutional development. Validating discharge estimates across flow conditions and evaluating their use in humanitarian decisions remain work for the next phase. That work should start with hydrologic questions and a defined humanitarian use, then test the complete chain from observation to validated data, interpretation, decision, communication, and action. That work calls for a durable partnership with clear responsibility for each step. [2–4]</w:t>
       </w:r>
     </w:p>
     <w:p>
@@ -210,7 +207,17 @@
     </w:p>
     <w:p>
       <w:r>
-        <w:t xml:space="preserve">The documented Sukabumi configuration uses an ANNKE C1200 Power over Ethernet (PoE) camera and Raspberry Pi 5 running ORC-OS. Every 30 minutes, the station wakes and captures a five-second video through the Real Time Streaming Protocol (RTSP). ORC-OS processes the video locally into velocity fields and discharge estimates, then synchronizes results and video to LiveORC over LTE. Witty Pi 5 controls scheduled power-on; ORC-OS controls shutdown. This division makes the interaction between task completion and power scheduling a service dependency. These are documented deployment settings, not a newly verified live inventory. [1, 5]</w:t>
+        <w:t xml:space="preserve">The October 2025 installation at Sukabumi used a PTBox with computing and cameras in a combined unit. The site already had a mounting pole, solar panels, a charge controller, and a battery when the team planned the April redeployment. The archived PTBox workflow includes remote maintenance mode, camera-view selection, and surveyed control points for relating the image to river geometry. These records show that installation involved site preparation, survey, configuration, and remote support as well as the equipment itself. [1, 8]</w:t>
+      </w:r>
+    </w:p>
+    <w:p>
+      <w:r>
+        <w:t xml:space="preserve">The April 2026 build separated the factory-sealed camera from the computing enclosure. The design record connects this choice to condensation in the earlier unit’s camera bay after it was opened in humid conditions. It also sets out requirements for commodity parts, replaceable modules, common tools, and assembly without soldering. These were practical design responses to the conditions and support needs encountered in the field. [8]</w:t>
+      </w:r>
+    </w:p>
+    <w:p>
+      <w:r>
+        <w:t xml:space="preserve">The documented April 2026 Sukabumi configuration uses an ANNKE C1200 Power over Ethernet (PoE) camera and Raspberry Pi 5 running ORC-OS. Every 30 minutes, the station wakes and captures a five-second video through the Real Time Streaming Protocol (RTSP). ORC-OS processes the video locally into velocity fields and discharge estimates, then synchronizes results and video to LiveORC over LTE. Witty Pi 5 controls scheduled power-on; ORC-OS controls shutdown. This division makes the interaction between task completion and power scheduling a service dependency. These are documented deployment settings, not a newly verified live inventory. [1, 5]</w:t>
       </w:r>
     </w:p>
     <w:p>
@@ -229,28 +236,22 @@
     </w:p>
     <w:p>
       <w:r>
-        <w:t xml:space="preserve">Solar operation couples compute time and communications recovery to the energy budget. Normal wakes were described as roughly two minutes, including 30–60 seconds of camera startup; failed cycles could reach a 25-minute backstop. A retry policy that is reasonable on an always-on server can consume scarce awake time or never run on this station. Proposed alternatives include mains-powered operation where feasible and separation of field acquisition from processing at a partner facility. The split architecture remains a design proposal, not a result demonstrated by this deployment. [2, 3, 5]</w:t>
-      </w:r>
-    </w:p>
-    <w:p>
-      <w:r>
-        <w:t xml:space="preserve">Good site selection is part of the measurement method. The camera needs a stable view of moving surface features, suitable geometry, and lighting that does not defeat the image processing. The survey and water-level reference must be accurate enough for the question being asked. Changing channel shape, glare, obscured views, or a failed water-level estimate can undermine the resulting discharge estimate. An independent reference method is needed before claims of discharge accuracy can be made for operational use. [5, 6]</w:t>
-      </w:r>
-    </w:p>
-    <w:p>
-      <w:r>
-        <w:t xml:space="preserve">LocalDevices and the upstream OpenRiverCam ecosystem provide the core measurement software and platform. The Indonesia team's contribution includes station engineering and integration, procurement, power and connectivity choices, survey and field procedures, operator documentation, deployment, and analysis of failures. The software stack provides opportunities for inspection and adaptation, but maintenance, support, licensing, and institutional ownership still require explicit arrangements. [1, 5]</w:t>
-      </w:r>
-    </w:p>
-    <w:p>
-      <w:r>
-        <w:rPr>
-          <w:b/>
-        </w:rPr>
-        <w:t xml:space="preserve">FIGURE 1 — Tom:</w:t>
-      </w:r>
-      <w:r>
-        <w:t xml:space="preserve"> System and data-flow diagram. Separate observed inputs, surveyed inputs, derived results, server delivery, quality review, and human decisions.</w:t>
+        <w:t xml:space="preserve">Solar operation couples compute time and communications recovery to the energy budget. Normal wakes were described as roughly two minutes, including 30–60 seconds of camera startup; cycles with processing errors could reach a 25-minute backstop. A retry policy that is reasonable on an always-on server can consume scarce awake time or never run on this station. Proposed alternatives include mains-powered operation where feasible and separation of field acquisition from processing at a partner facility. The split architecture remains a design proposal, not a result demonstrated by this deployment. [2, 3, 5]</w:t>
+      </w:r>
+    </w:p>
+    <w:p>
+      <w:r>
+        <w:t xml:space="preserve">Good site selection is part of the measurement method. The camera needs a stable view of moving surface features, suitable geometry, and lighting suitable for image processing. The survey and water-level reference must be accurate enough for the question being asked. Changing channel shape, glare, obscured views, or an invalid water-level estimate can undermine the resulting discharge estimate. An independent reference method is needed before claims of discharge accuracy can be made for operational use. [5, 6]</w:t>
+      </w:r>
+    </w:p>
+    <w:p>
+      <w:r>
+        <w:t xml:space="preserve">LocalDevices and the upstream OpenRiverCam ecosystem provide the core measurement software and platform. The Indonesia team's contribution includes station engineering and integration, procurement, power and connectivity choices, survey and field procedures, operator documentation, deployment, and analysis of field performance. The software stack provides opportunities for inspection and adaptation, but maintenance, support, licensing, and institutional ownership still require explicit arrangements. [1, 5]</w:t>
+      </w:r>
+    </w:p>
+    <w:p>
+      <w:r>
+        <w:t xml:space="preserve">FIGURE 1 — Tom: System and data-flow diagram showing the October 2025 PTBox and April 2026 Tom-built configurations, with unconfirmed PTBox details left open. Separate observed inputs, surveyed inputs, derived results, server delivery, quality review, and human decisions.</w:t>
       </w:r>
     </w:p>
     <w:p>
@@ -276,16 +277,49 @@
       </w:r>
     </w:p>
     <w:p>
-      <w:pPr>
-        <w:pStyle w:val="Heading2"/>
-      </w:pPr>
-      <w:r>
-        <w:t xml:space="preserve">3. The Indonesia project was built through collaboration</w:t>
-      </w:r>
-    </w:p>
-    <w:p>
-      <w:r>
-        <w:t xml:space="preserve">The American Red Cross and PMI partnered to explore a practical river-monitoring installation in Indonesia. The intended Jakarta installation would have been an always-on, mains-powered demonstration and testing station near PMI headquarters. It was built and prepared in software, but the planned site did not receive the needed permission. The Sukabumi station was installed in April 2026 and became the project's field learning site. [1]</w:t>
+      <w:r>
+        <w:t xml:space="preserve">3. Two installations developed through collaboration</w:t>
+      </w:r>
+    </w:p>
+    <w:p>
+      <w:r>
+        <w:t xml:space="preserve">The American Red Cross and PMI partnered to explore practical river monitoring in Indonesia. The project included an October 2025 installation using a PTBox, followed by an April 2026 installation using devices built by Tom Jordan. This chronology places the work in a continuing process of field learning and development. [1]</w:t>
+      </w:r>
+    </w:p>
+    <w:p>
+      <w:pPr>
+        <w:pStyle w:val="Heading2"/>
+      </w:pPr>
+      <w:r>
+        <w:t xml:space="preserve">October 2025 — PTBox installation</w:t>
+      </w:r>
+    </w:p>
+    <w:p>
+      <w:r>
+        <w:t xml:space="preserve">The October 2025 PTBox installation at Sukabumi established the first field setting for the work covered here. Preparatory records address site access, mounting, solar power, camera orientation, control-point survey, cellular connectivity, and access to the software. A pre-installation discussion between Tom and Hessel Winsemius addressed camera positioning, fixing the view before survey, and arrangements for remote support. The surviving transcript also records plans to involve Salvador for hardware guidance. It documents preparation and intended support, rather than a complete list of people present at the installation. [8]</w:t>
+      </w:r>
+    </w:p>
+    <w:p>
+      <w:r>
+        <w:t xml:space="preserve">The experience made environmental protection and service access concrete design questions. The site record attributes the earlier combined unit’s interruption to trapped humidity. Camera research records condensation after opening the camera bay in very humid air, while the PTBox survey procedure warns that starting a malfunctioning camera could lock up the unit. These observations gave the team specific requirements to address in the next build: protect the optics during servicing and make components easier to inspect and replace. [8]</w:t>
+      </w:r>
+    </w:p>
+    <w:p>
+      <w:r>
+        <w:t xml:space="preserve">TASK — Tom/Teguh: Check the October account against field photographs and records, confirm individual credits, and add any dated operating results suitable for publication.</w:t>
+      </w:r>
+    </w:p>
+    <w:p>
+      <w:pPr>
+        <w:pStyle w:val="Heading2"/>
+      </w:pPr>
+      <w:r>
+        <w:t xml:space="preserve">April 2026 — devices built by Tom Jordan</w:t>
+      </w:r>
+    </w:p>
+    <w:p>
+      <w:r>
+        <w:t xml:space="preserve">For the April 2026 phase, Tom built the Sukabumi and Jakarta devices. The intended Jakarta installation would have been an always-on, mains-powered demonstration and testing station near PMI headquarters. It was built and prepared in software, but the planned site did not receive the needed permission. The Sukabumi station was installed in April 2026 at the existing solar-powered site, continuing the field work begun with the PTBox. [1]</w:t>
       </w:r>
     </w:p>
     <w:p>
@@ -295,7 +329,7 @@
     </w:p>
     <w:p>
       <w:r>
-        <w:t xml:space="preserve">IPB University supplied a decisive technical contribution. After two RTK surveys produced unsuitable control data, IPB conducted a total-station re-survey that supports the deployed camera configuration. The project log also records plans for IPB to analyze OpenRiverCam data, integrate rain gauges, and develop a community-facing dashboard. Those plans should be described as ongoing work until IPB confirms their status. BHLK has provided technical engagement, including a reference discharge measurement and questions about capture duration and hosting. Its formal name, the measurement details, and any future role need direct confirmation. [1, 3]</w:t>
+        <w:t xml:space="preserve">IPB University supplied a decisive technical contribution. The initial RTK surveys established that a different survey approach was needed under the site’s conditions. IPB conducted a total-station re-survey that supports the deployed camera configuration. The project log also records plans for IPB to analyze OpenRiverCam data, integrate rain gauges, and develop a community-facing dashboard. Those plans should be described as ongoing work until IPB confirms their status. BHLK has provided technical engagement, including a reference discharge measurement and questions about capture duration and hosting. Its formal name, the measurement details, and any future role need direct confirmation. [1, 3]</w:t>
       </w:r>
     </w:p>
     <w:p>
@@ -338,61 +372,148 @@
     </w:p>
     <w:p>
       <w:r>
+        <w:t xml:space="preserve">TASK — Tom: Complete the chronology from October 2025 through April 2026 and subsequent operation. Attribute survey work, hardware changes, and partner contributions to the correct phase; distinguish completed work from planned work.</w:t>
+      </w:r>
+    </w:p>
+    <w:p>
+      <w:r>
+        <w:t xml:space="preserve">FIGURE 2: Two-phase installation chronology with approved photographs or a site/status panel. Include October 2025 PTBox and April 2026 Tom-built devices, dates, credits, and image permissions; identify the Jakarta unit as built but undeployed.</w:t>
+      </w:r>
+    </w:p>
+    <w:p>
+      <w:r>
+        <w:t xml:space="preserve">4. What the installations established and the next validation steps</w:t>
+      </w:r>
+    </w:p>
+    <w:p>
+      <w:r>
+        <w:t xml:space="preserve">The two installations provide the basis for tracing the evolution of the equipment, field methods, and support arrangements. The quantitative evidence assembled here concerns the station installed at Sukabumi in April 2026 and its subsequent operation. The PTBox record establishes the earlier field configuration, survey and maintenance workflow, and environmental observations that informed subsequent design. It does not supply an equivalent performance dataset for a numerical comparison here. [1–3, 8]</w:t>
+      </w:r>
+    </w:p>
+    <w:p>
+      <w:r>
+        <w:t xml:space="preserve">TASK — Tom: Check archived PTBox operating records for dated results suitable for inclusion. Keep qualitative design learning separate from measured changes in performance.</w:t>
+      </w:r>
+    </w:p>
+    <w:p>
+      <w:r>
+        <w:t xml:space="preserve">The April 2026 station established that this team could assemble a field unit, install it at Sukabumi, operate it off grid on a scheduled cycle, and generate images and data products. The deployment also produced documentation for assembly, survey, operation, and troubleshooting. Together, these outcomes provide a foundation for evaluating sustained data availability, discharge accuracy, and an operational decision pathway. Those evaluations remain to be completed. [1–3]</w:t>
+      </w:r>
+    </w:p>
+    <w:p>
+      <w:r>
+        <w:t xml:space="preserve">The survey work clarified how to select and verify a measurement method for this site. Two RTK attempts produced large spread and drift. A processing workflow could build an internally coherent interim fit from those observations, but the underlying control was not suitable for a trusted discharge estimate. IPB’s total-station survey supplied the control data used for the deployed calibration. The deployed </w:t>
+      </w:r>
+      <w:r>
+        <w:rPr>
+          <w:rFonts w:ascii="Consolas" w:hAnsi="Consolas"/>
+        </w:rPr>
+        <w:t xml:space="preserve">Fit 6</w:t>
+      </w:r>
+      <w:r>
+        <w:t xml:space="preserve"> camera configuration achieved a 0.037 m fit root-mean-square error against a 5 cm target. That statistic describes the camera calibration fit. It does not measure final water-level, surface-velocity, or discharge accuracy. [2, 3, 5]</w:t>
+      </w:r>
+    </w:p>
+    <w:p>
+      <w:r>
+        <w:t xml:space="preserve">Field operation helped the team distinguish station availability, processing quality, and data delivery as separate measures of reliability. In an August 27 snapshot, 2,324 of 5,406 local video rows had a processing error and 2,744 showed failed synchronization. A reconstructed April–August record identified 13 interruptions in 133.5 observed days and roughly 24.8 days of estimated true downtime after separating some upload gaps from station downtime. These figures describe a historical pilot window and the method used to reconstruct it; they should not be presented as a current availability rate or a production benchmark. [3]</w:t>
+      </w:r>
+    </w:p>
+    <w:p>
+      <w:r>
+        <w:t xml:space="preserve">The team also needs a valid independent comparison for discharge. BHLK measured discharge at Sukabumi in August, and a comparison with OpenRiverCam output was requested. The method, result, timing, and uncertainty are not yet assembled into a defensible validation statement. A future comparison should span useful flow conditions and should preserve the uncertainty of both methods. [1, 3]</w:t>
+      </w:r>
+    </w:p>
+    <w:p>
+      <w:r>
         <w:rPr>
           <w:b/>
         </w:rPr>
         <w:t xml:space="preserve">TASK — Tom:</w:t>
       </w:r>
       <w:r>
-        <w:t xml:space="preserve"> Add a short chronology with dates and distinguish completed work from planned work.</w:t>
-      </w:r>
-    </w:p>
-    <w:p>
-      <w:r>
-        <w:rPr>
-          <w:b/>
-        </w:rPr>
-        <w:t xml:space="preserve">FIGURE 2:</w:t>
-      </w:r>
-      <w:r>
-        <w:t xml:space="preserve"> Approved site map/status panel or field photograph with names, date, credit, and image permission.</w:t>
-      </w:r>
-    </w:p>
-    <w:p>
-      <w:pPr>
-        <w:pStyle w:val="Heading2"/>
-      </w:pPr>
-      <w:r>
-        <w:t xml:space="preserve">4. What Sukabumi showed, and what it did not</w:t>
-      </w:r>
-    </w:p>
-    <w:p>
-      <w:r>
-        <w:t xml:space="preserve">The station established that this team could assemble a field unit, install it at Sukabumi, operate it off grid on a scheduled cycle, and generate images and data products. The deployment also produced documentation for assembly, survey, operation, and troubleshooting. These are real outcomes. They do not by themselves demonstrate sustained data availability, validated discharge accuracy, or an operational decision pathway. [1–3]</w:t>
-      </w:r>
-    </w:p>
-    <w:p>
-      <w:r>
-        <w:t xml:space="preserve">The survey history shows why a technically plausible output can still be wrong. Two RTK attempts produced large spread and drift. A processing workflow could build an internally coherent interim fit from those observations, but the underlying control was not suitable for a trusted discharge estimate. IPB's total-station survey changed the method. The deployed </w:t>
-      </w:r>
-      <w:r>
-        <w:rPr>
-          <w:rFonts w:ascii="Consolas" w:hAnsi="Consolas"/>
-        </w:rPr>
-        <w:t xml:space="preserve">Fit 6</w:t>
-      </w:r>
-      <w:r>
-        <w:t xml:space="preserve"> camera configuration achieved a 0.037 m fit root-mean-square error against a 5 cm target. That statistic describes the camera calibration fit. It does not measure final water-level, surface-velocity, or discharge accuracy. [2, 3, 5]</w:t>
-      </w:r>
-    </w:p>
-    <w:p>
-      <w:r>
-        <w:t xml:space="preserve">The operational data show why the team needs several measures of reliability. In an August 27 snapshot, 2,324 of 5,406 local video rows had a processing error and 2,744 showed failed synchronization. A reconstructed April–August record identified 13 interruptions in 133.5 observed days and roughly 24.8 days of estimated true downtime after separating some upload gaps from station downtime. These figures describe a historical pilot window and the method used to reconstruct it; they should not be presented as a current availability rate or a production benchmark. [3]</w:t>
-      </w:r>
-    </w:p>
-    <w:p>
-      <w:r>
-        <w:t xml:space="preserve">The team also needs a valid independent comparison for discharge. BHLK measured discharge at Sukabumi in August, and a comparison with OpenRiverCam output was requested. The method, result, timing, and uncertainty are not yet assembled into a defensible validation statement. A future comparison should span useful flow conditions and should preserve the uncertainty of both methods. [1, 3]</w:t>
+        <w:t xml:space="preserve"> Replace historical figures with a dated table of scheduled captures, successful captures, valid water levels, processed results, successful uploads, user-visible results, and gaps. Keep denominators and definitions in the source note.</w:t>
+      </w:r>
+    </w:p>
+    <w:p>
+      <w:r>
+        <w:rPr>
+          <w:b/>
+        </w:rPr>
+        <w:t xml:space="preserve">TASK — Tom/BHLK:</w:t>
+      </w:r>
+      <w:r>
+        <w:t xml:space="preserve"> Document the August reference measurement and any comparable ORC results; omit an accuracy conclusion until supported.</w:t>
+      </w:r>
+    </w:p>
+    <w:p>
+      <w:r>
+        <w:rPr>
+          <w:b/>
+        </w:rPr>
+        <w:t xml:space="preserve">FIGURE 3:</w:t>
+      </w:r>
+      <w:r>
+        <w:t xml:space="preserve"> One verified calibration view, time series, or AR view, with date, units, provenance, and a caption that states what it demonstrates.</w:t>
+      </w:r>
+    </w:p>
+    <w:p>
+      <w:pPr>
+        <w:pStyle w:val="Heading2"/>
+      </w:pPr>
+      <w:r>
+        <w:t xml:space="preserve">5. Field learning informs the next design</w:t>
+      </w:r>
+    </w:p>
+    <w:p>
+      <w:r>
+        <w:t xml:space="preserve">The October 2025 experience informed a change in how the camera was packaged and serviced. The April build used a separate, factory-sealed PoE camera so that work on the computing enclosure would not require opening the optical housing. Sukabumi retained its existing solar infrastructure, while the new build emphasized replaceable components and documented maintenance. The lesson was to design environmental protection and field service together. The records establish the rationale and the architectural change; they do not establish a measured improvement in lifetime or availability over the PTBox. [8]</w:t>
+      </w:r>
+    </w:p>
+    <w:p>
+      <w:r>
+        <w:t xml:space="preserve">The April 2026 station then provided experience with the revised architecture. The following examples connect those later observations to refinements and further tests, distinguishing established behavior from suspected causes.</w:t>
+      </w:r>
+    </w:p>
+    <w:p>
+      <w:r>
+        <w:t xml:space="preserve">Water-level detection is one example from the later operating record. In a July sample of 100 videos with accepted water-level results and 100 with rejected results, every rejection occurred during daylight; none occurred at night. The time pattern is consistent with reflected sunlight, but direct image-based confirmation was still pending in the reviewed record. Lowering the acceptance threshold would admit weak readings and yield accepted results for few of the rejected cases. When water-level detection does not produce an accepted result, the full processing run is discarded, including velocity information that may otherwise be usable. The next design should test lighting at the actual site and add an independent water-level reference. [3, 6]</w:t>
+      </w:r>
+    </w:p>
+    <w:p>
+      <w:r>
+        <w:t xml:space="preserve">Field experience showed that storage capacity, processing time, and power scheduling need to be designed together. A USB storage problem led the team to put the operating system and video on a smaller SD card. Low free space coincided with processing errors. Shutdown waited for processing to finish, so cycles with processing errors could remain awake until a 25-minute backstop instead of ending after roughly two minutes. The extra load could drain the battery, and a missed wake could turn a short processing interruption into a longer period offline. This chain argues for durable storage, power and disk telemetry, and one controller responsible for the entire wake and shutdown sequence. [3]</w:t>
+      </w:r>
+    </w:p>
+    <w:p>
+      <w:r>
+        <w:t xml:space="preserve">Data delivery highlighted the value of monitoring each stage separately. Sensor rows continued during a 12-day gap in server video, suggesting that the station and the delivery path had different health states. In another event, scheduled boots continued during a 4.8-day period without remote reachability. The operating record attributes that outage to an unfunded prepaid SIM; the account balance has not been independently verified. These cases show why an operator needs to know whether the station woke, captured, processed, queued, uploaded, and made data available to users. They also show why a recurring connectivity payment needs an owner. [3]</w:t>
+      </w:r>
+    </w:p>
+    <w:p>
+      <w:r>
+        <w:t xml:space="preserve">Software investigation identified two concrete opportunities to improve delivery and recovery. A September 2 analysis of ORC-OS 0.6.0 found that backlog synchronization starts after a 60-second delay, while the capture path can shut down the station about 15 seconds after completing the current job. Across 823 observed boots, the backlog task was cut off before checking on 45% of wakes. On the remaining wakes it searched a queue that failed records did not enter. Both the available synchronization time and the selection of records for retry therefore needed attention. [7]</w:t>
+      </w:r>
+    </w:p>
+    <w:p>
+      <w:r>
+        <w:t xml:space="preserve">A separate LiveORC investigation found that an upload could commit its video row and file, then fail while attaching a time series already assigned to another video. The one-to-one database constraint produced HTTP 500, while the station marked the upload failed even though the clip existed on the server. The technical lesson is to distinguish transport failure, partial server completion, and processing failure; recovery must reconcile records on both sides before assuming that retransmission restores a usable result. These findings describe the investigated versions and dates, not a claim that the defects remain present today. [7]</w:t>
+      </w:r>
+    </w:p>
+    <w:p>
+      <w:r>
+        <w:t xml:space="preserve">The Jakarta preparation also clarified the importance of confirming site arrangements early. The team completed the station, but permission for the intended location was not secured and it remained undeployed. Future planning should establish written permission and a viable maintenance arrangement before site-specific construction. [1]</w:t>
+      </w:r>
+    </w:p>
+    <w:p>
+      <w:r>
+        <w:rPr>
+          <w:b/>
+        </w:rPr>
+        <w:t xml:space="preserve">TABLE 1 — Tom:</w:t>
+      </w:r>
+      <w:r>
+        <w:t xml:space="preserve"> Four-row “observation / consequence / response / remaining test” table covering survey, optical level, duty-cycle/storage, and data delivery.</w:t>
       </w:r>
     </w:p>
     <w:p>
@@ -403,93 +524,6 @@
         <w:t xml:space="preserve">TASK — Tom:</w:t>
       </w:r>
       <w:r>
-        <w:t xml:space="preserve"> Replace historical figures with a dated table of scheduled captures, successful captures, valid water levels, processed results, successful uploads, user-visible results, and gaps. Keep denominators and definitions in the source note.</w:t>
-      </w:r>
-    </w:p>
-    <w:p>
-      <w:r>
-        <w:rPr>
-          <w:b/>
-        </w:rPr>
-        <w:t xml:space="preserve">TASK — Tom/BHLK:</w:t>
-      </w:r>
-      <w:r>
-        <w:t xml:space="preserve"> Document the August reference measurement and any comparable ORC results; omit an accuracy conclusion until supported.</w:t>
-      </w:r>
-    </w:p>
-    <w:p>
-      <w:r>
-        <w:rPr>
-          <w:b/>
-        </w:rPr>
-        <w:t xml:space="preserve">FIGURE 3:</w:t>
-      </w:r>
-      <w:r>
-        <w:t xml:space="preserve"> One verified calibration view, time series, or AR view, with date, units, provenance, and a caption that states what it demonstrates.</w:t>
-      </w:r>
-    </w:p>
-    <w:p>
-      <w:pPr>
-        <w:pStyle w:val="Heading2"/>
-      </w:pPr>
-      <w:r>
-        <w:t xml:space="preserve">5. Failure exposed the full operating chain</w:t>
-      </w:r>
-    </w:p>
-    <w:p>
-      <w:r>
-        <w:t xml:space="preserve">The project encountered failures at several points in the chain from image to usable information. Their value lies in the changes they suggest, provided that the paper distinguishes observation from suspected cause.</w:t>
-      </w:r>
-    </w:p>
-    <w:p>
-      <w:r>
-        <w:t xml:space="preserve">Water-level detection is one example. In a July sample of 100 passing and 100 failing videos, every failure occurred during daylight; none occurred at night. The time pattern is consistent with reflected sunlight, but direct image-based confirmation was still pending in the reviewed record. Lowering the acceptance threshold would admit weak readings and recover few of the failed cases. When water-level detection fails, the full processing run is discarded, including velocity information that may otherwise be usable. The next design should test lighting at the actual site and add an independent water-level reference. [3, 6]</w:t>
-      </w:r>
-    </w:p>
-    <w:p>
-      <w:r>
-        <w:t xml:space="preserve">Storage and scheduling failures compounded each other. A USB storage problem led the team to put the operating system and video on a smaller SD card. Low free space coincided with processing errors. Shutdown waited for processing to finish, so failed cycles could remain awake until a 25-minute backstop instead of ending after roughly two minutes. The extra load could drain the battery, and a missed wake could turn a short fault into a longer interruption. This chain argues for durable storage, power and disk telemetry, and one controller responsible for the entire wake and shutdown sequence. [3]</w:t>
-      </w:r>
-    </w:p>
-    <w:p>
-      <w:r>
-        <w:t xml:space="preserve">Data delivery created a different kind of ambiguity. Sensor rows continued during a 12-day gap in server video, suggesting that the station and the delivery path had different health states. In another event, scheduled boots continued during a 4.8-day period without remote reachability. The operating record attributes that outage to an unfunded prepaid SIM; the account balance has not been independently verified. These cases show why an operator needs to know whether the station woke, captured, processed, queued, uploaded, and made data available to users. They also show why a recurring connectivity payment needs an owner. [3]</w:t>
-      </w:r>
-    </w:p>
-    <w:p>
-      <w:r>
-        <w:t xml:space="preserve">Two software incidents make the delivery boundary more specific. A September 2 analysis of ORC-OS 0.6.0 found that backlog synchronization starts after a 60-second delay, while the capture path can shut down the station about 15 seconds after completing the current job. Across 823 observed boots, the backlog task was cut off before checking on 45% of wakes. On the remaining wakes it searched a queue that failed records did not enter. Extending awake time alone would therefore leave a second fault unresolved. [7]</w:t>
-      </w:r>
-    </w:p>
-    <w:p>
-      <w:r>
-        <w:t xml:space="preserve">A separate LiveORC investigation found that an upload could commit its video row and file, then fail while attaching a time series already assigned to another video. The one-to-one database constraint produced HTTP 500, while the station marked the upload failed even though the clip existed on the server. The technical lesson is to distinguish transport failure, partial server completion, and processing failure; recovery must reconcile records on both sides before assuming that retransmission restores a usable result. These findings describe the investigated versions and dates, not a claim that the defects remain present today. [7]</w:t>
-      </w:r>
-    </w:p>
-    <w:p>
-      <w:r>
-        <w:t xml:space="preserve">Finally, Jakarta's site-permission failure was operational rather than computational. The team completed a station that could not serve its intended location. Written permission and a viable maintenance arrangement should precede site-specific construction. [1]</w:t>
-      </w:r>
-    </w:p>
-    <w:p>
-      <w:r>
-        <w:rPr>
-          <w:b/>
-        </w:rPr>
-        <w:t xml:space="preserve">TABLE 1 — Tom:</w:t>
-      </w:r>
-      <w:r>
-        <w:t xml:space="preserve"> Four-row “observation / consequence / response / remaining test” table covering survey, optical level, duty-cycle/storage, and data delivery.</w:t>
-      </w:r>
-    </w:p>
-    <w:p>
-      <w:r>
-        <w:rPr>
-          <w:b/>
-        </w:rPr>
-        <w:t xml:space="preserve">TASK — Tom:</w:t>
-      </w:r>
-      <w:r>
         <w:t xml:space="preserve"> Check whether later testing confirmed the glare hypothesis or changed the recommended water-level method.</w:t>
       </w:r>
     </w:p>
@@ -524,7 +558,7 @@
     </w:p>
     <w:p>
       <w:r>
-        <w:t xml:space="preserve">The operating model also needs money and governance. The recorded Sukabumi electronics and enclosure bill was approximately US$1,340, excluding the existing solar panel and battery. It also excludes shipping, customs, site work, survey, labor, travel, training, connectivity, hosting, spare parts, replacement, and long-term support. Tom reports that current costs are grant-funded through the end of 2026. Hosting transition, SIM funding, data export, and post-grant maintenance remain open. A low materials bill is useful, but it cannot stand in for installed or lifecycle cost. [1, 3]</w:t>
+        <w:t xml:space="preserve">The operating model also needs money and governance. The recorded April 2026 Sukabumi electronics and enclosure bill was approximately US$1,340, excluding the existing solar panel and battery. It also excludes shipping, customs, site work, survey, labor, travel, training, connectivity, hosting, spare parts, replacement, and long-term support. Tom reports that current costs are grant-funded through the end of 2026. Hosting transition, SIM funding, data export, and post-grant maintenance remain open. A low materials bill is useful, but it cannot stand in for installed or lifecycle cost. [1, 3]</w:t>
       </w:r>
     </w:p>
     <w:p>
@@ -534,7 +568,7 @@
     </w:p>
     <w:p>
       <w:r>
-        <w:t xml:space="preserve">For an operational handover, we propose a defined data contract between the monitoring service and downstream dashboards or decision tools. Each observation should carry a station identifier, capture time and time zone, units, processing and quality status, configuration provenance, and delivery time. Reprocessed observations should remain distinguishable from earlier results, and missing or rejected measurements should remain explicit. A dashboard must be able to distinguish an old valid observation from a new failed one. This is a proposed integration requirement; the project has not yet established it as a complete implemented interface.</w:t>
+        <w:t xml:space="preserve">For an operational handover, we propose a defined data contract between the monitoring service and downstream dashboards or decision tools. Each observation should carry a station identifier, capture time and time zone, units, processing and quality status, configuration provenance, and delivery time. Reprocessed observations should remain distinguishable from earlier results, and missing or rejected measurements should remain explicit. A dashboard must be able to distinguish an old valid observation from a new rejected one. This is a proposed integration requirement; the project has not yet established it as a complete implemented interface.</w:t>
       </w:r>
     </w:p>
     <w:p>
@@ -657,12 +691,12 @@
     </w:p>
     <w:p>
       <w:r>
-        <w:t xml:space="preserve">The Indonesia project shows both the attraction and the difficulty of emerging monitoring technology. A relatively modest materials budget and adaptable components can put a capable instrument in the field. Reliable measurements require suitable sites, skilled survey, independent validation, dependable operation, and care for the data and people the camera may capture. Useful humanitarian information requires further work: analysis, authority, communication, and practiced action. [1–4]</w:t>
-      </w:r>
-    </w:p>
-    <w:p>
-      <w:r>
-        <w:t xml:space="preserve">The strongest result so far is therefore a way of working. PMI's local presence, IPB's survey and scientific work, BHLK's technical engagement, the American Red Cross's support, community volunteers, and the upstream developers each contribute a piece of the capability. Future pilots should make those relationships durable, assign responsibilities openly, and evaluate whether the resulting information actually improves decisions. Technology will mature through testing and repair; the partnerships built around it can support a wider shared response to flood, drought, and climate risk.</w:t>
+        <w:t xml:space="preserve">The October 2025 PTBox installation and the April 2026 installation using devices built by Tom Jordan form two stages of the Indonesia project’s development. Together, their experience provides the basis for understanding how camera-based river monitoring can be adapted to field conditions and supported through partnership. A relatively modest materials budget and adaptable components can put a capable instrument in the field. Reliable measurements require suitable sites, skilled survey, independent validation, dependable operation, and care for the data and people the camera may capture. Useful humanitarian information requires further work: analysis, authority, communication, and practiced action. [1–4]</w:t>
+      </w:r>
+    </w:p>
+    <w:p>
+      <w:r>
+        <w:t xml:space="preserve">The strongest result so far is therefore a way of working. PMI's local presence, IPB's survey and scientific work, BHLK's technical engagement, the American Red Cross's support, community volunteers, and the upstream developers each contribute a piece of the capability. Future pilots should make those relationships durable, assign responsibilities openly, and evaluate whether the resulting information actually improves decisions. Technology will mature through field learning, testing, and refinement; the partnerships built around it can support a wider shared response to flood, drought, and climate risk.</w:t>
       </w:r>
     </w:p>
     <w:p>
@@ -691,16 +725,7 @@
     </w:p>
     <w:p>
       <w:r>
-        <w:t xml:space="preserve">1. </w:t>
-      </w:r>
-      <w:r>
-        <w:rPr>
-          <w:b/>
-        </w:rPr>
-        <w:t xml:space="preserve">Project and partners:</w:t>
-      </w:r>
-      <w:r>
-        <w:t xml:space="preserve"> source note 1 (source_notes/01-project-and-partnerships.md); primary records include the repository overview (../README.md), deployment overview (../spring_2026_ID/README.md), issue log (../spring_2026_ID/ISSUE_LOG.md), and program TODO (../PROGRAM_TODO.md). Partner descriptions and plans require confirmation.</w:t>
+        <w:t xml:space="preserve">1. Project and partners: source note 1 (source_notes/01-project-and-partnerships.md); primary records include the repository overview (../README.md), deployment overview (../spring_2026_ID/README.md), issue log (../spring_2026_ID/ISSUE_LOG.md), and program TODO (../PROGRAM_TODO.md). The two-installation chronology was clarified by Tom on September 23, 2026; source note 8 traces the earlier field experience and design transition. Partner descriptions and plans require confirmation.</w:t>
       </w:r>
     </w:p>
     <w:p>
@@ -725,7 +750,7 @@
         <w:rPr>
           <w:b/>
         </w:rPr>
-        <w:t xml:space="preserve">Field metrics, failures, and costs:</w:t>
+        <w:t xml:space="preserve">Field metrics, lessons, and costs:</w:t>
       </w:r>
       <w:r>
         <w:t xml:space="preserve"> source note 3 (source_notes/03-field-evidence-and-lessons.md), findings (../spring_2026_ID/findings/), lessons learned (../spring_2026_ID/LESSONS_LEARNED.md), and Sukabumi BOM (../spring_2026_ID/BOM_Sukabumi.md). Historical windows must be dated and updated before release.</w:t>
@@ -770,7 +795,7 @@
         <w:t xml:space="preserve">Optical water-level analysis:</w:t>
       </w:r>
       <w:r>
-        <w:t xml:space="preserve"> daylight failure finding (../spring_2026_ID/findings/optical_wl_daytime_glint.md). The daylight pattern is observed; glare remains a hypothesis until direct image review confirms it.</w:t>
+        <w:t xml:space="preserve"> daylight water-level findings (../spring_2026_ID/findings/optical_wl_daytime_glint.md). The daylight pattern is observed; glare remains a hypothesis until direct image review confirms it.</w:t>
       </w:r>
     </w:p>
     <w:p>
@@ -781,10 +806,15 @@
         <w:rPr>
           <w:b/>
         </w:rPr>
-        <w:t xml:space="preserve">Synchronization failure mechanisms:</w:t>
+        <w:t xml:space="preserve">Synchronization and recovery findings:</w:t>
       </w:r>
       <w:r>
         <w:t xml:space="preserve"> ORC-OS 0.6.0 backlog analysis, September 2 (../spring_2026_ID/findings/orc_os_backlog_sync_starvation.md) and LiveORC partial upload/database collision, September 3 (../spring_2026_ID/findings/liveorc_video_500_timeseries_collision_2026-09-03.md). Version-specific incident evidence; distinguish historical findings from current software status.</w:t>
+      </w:r>
+    </w:p>
+    <w:p>
+      <w:r>
+        <w:t xml:space="preserve">8. PTBox installation and design evolution: source note 5 (source_notes/05-ptbox-and-design-evolution.md), drawing on the Sukabumi site record (../spring_2026_ID/SITES.md), camera-options rationale (../rc-box/research/camera_options_summary.md), PTBox survey procedure (../survey/SURVEY_PROCESS_v2.md), and archived preparation and design records. Distinguish documented observations, design requirements, and measured outcomes.</w:t>
       </w:r>
     </w:p>
     <w:sectPr>

</xml_diff>